<commit_message>
fix(ref-forms): WO-056 DOCX hRule + 행높이 PDF 정합화
- HeightRule.AT_LEAST(undefined)→HeightRule.ATLEAST: 전체 9개소 수정
  → 모든 w:trHeight에 w:hRule="atLeast" 기록, 최소 높이 계약 보장
- ROW_H_GOAL: mm(22)→mm(20) (전사목표 PDF 20mm와 통일)
- ROW_H_INFO: mm(8)→mm(7) (기본정보 PDF 7mm와 통일)
- blank.docx 13행 / example.docx 18행 전수 atLeast + twips 검증 PASS
- WO-056-DOCX-QA-REPORT.md 추가

Co-Authored-By: Claude Sonnet 4.6 <noreply@anthropic.com>
</commit_message>
<xml_diff>
--- a/docs/reference-forms/output/TAI-FORM-C002-blank.docx
+++ b/docs/reference-forms/output/TAI-FORM-C002-blank.docx
@@ -20,7 +20,7 @@
       </w:tblGrid>
       <w:tr>
         <w:trPr>
-          <w:trHeight w:val="793"/>
+          <w:trHeight w:val="793" w:hRule="atLeast"/>
         </w:trPr>
         <w:tc>
           <w:tcPr>
@@ -133,7 +133,7 @@
             </w:tblGrid>
             <w:tr>
               <w:trPr>
-                <w:trHeight w:val="396"/>
+                <w:trHeight w:val="396" w:hRule="atLeast"/>
               </w:trPr>
               <w:tc>
                 <w:tcPr>
@@ -240,7 +240,7 @@
             </w:tr>
             <w:tr>
               <w:trPr>
-                <w:trHeight w:val="850"/>
+                <w:trHeight w:val="850" w:hRule="atLeast"/>
               </w:trPr>
               <w:tc>
                 <w:tcPr>
@@ -341,7 +341,7 @@
       </w:tblGrid>
       <w:tr>
         <w:trPr>
-          <w:trHeight w:val="453"/>
+          <w:trHeight w:val="396" w:hRule="atLeast"/>
         </w:trPr>
         <w:tc>
           <w:tcPr>
@@ -410,7 +410,7 @@
       </w:tr>
       <w:tr>
         <w:trPr>
-          <w:trHeight w:val="453"/>
+          <w:trHeight w:val="396" w:hRule="atLeast"/>
         </w:trPr>
         <w:tc>
           <w:tcPr>
@@ -504,7 +504,7 @@
       </w:tblGrid>
       <w:tr>
         <w:trPr>
-          <w:trHeight w:val="396"/>
+          <w:trHeight w:val="396" w:hRule="atLeast"/>
         </w:trPr>
         <w:tc>
           <w:tcPr>
@@ -543,7 +543,7 @@
       </w:tr>
       <w:tr>
         <w:trPr>
-          <w:trHeight w:val="1247"/>
+          <w:trHeight w:val="1133" w:hRule="atLeast"/>
         </w:trPr>
         <w:tc>
           <w:tcPr>
@@ -602,7 +602,7 @@
       <w:tr>
         <w:trPr>
           <w:tblHeader/>
-          <w:trHeight w:val="453"/>
+          <w:trHeight w:val="453" w:hRule="atLeast"/>
         </w:trPr>
         <w:tc>
           <w:tcPr>
@@ -837,7 +837,7 @@
       </w:tr>
       <w:tr>
         <w:trPr>
-          <w:trHeight w:val="793"/>
+          <w:trHeight w:val="793" w:hRule="atLeast"/>
         </w:trPr>
         <w:tc>
           <w:tcPr>
@@ -1034,7 +1034,7 @@
       </w:tr>
       <w:tr>
         <w:trPr>
-          <w:trHeight w:val="793"/>
+          <w:trHeight w:val="793" w:hRule="atLeast"/>
         </w:trPr>
         <w:tc>
           <w:tcPr>
@@ -1231,7 +1231,7 @@
       </w:tr>
       <w:tr>
         <w:trPr>
-          <w:trHeight w:val="793"/>
+          <w:trHeight w:val="793" w:hRule="atLeast"/>
         </w:trPr>
         <w:tc>
           <w:tcPr>
@@ -1428,7 +1428,7 @@
       </w:tr>
       <w:tr>
         <w:trPr>
-          <w:trHeight w:val="793"/>
+          <w:trHeight w:val="793" w:hRule="atLeast"/>
         </w:trPr>
         <w:tc>
           <w:tcPr>
@@ -1625,7 +1625,7 @@
       </w:tr>
       <w:tr>
         <w:trPr>
-          <w:trHeight w:val="793"/>
+          <w:trHeight w:val="793" w:hRule="atLeast"/>
         </w:trPr>
         <w:tc>
           <w:tcPr>

</xml_diff>

<commit_message>
fix(ref-forms): WO-057B Candidate B — 결재란 독립 90mm 우측 정렬 테이블
- buildApproval(): 170mm noBorder래퍼+중첩 → 90mm 독립 AlignmentType.RIGHT 테이블
- buildDoc(): 제목↔결재란 사이 spacer0()(before=0/after=0) 삽입
- 효과: Google Docs 인접 테이블 병합 방지, 중첩 테이블/noBorder 셀 제거
- 검증: body=[tbl,p,tbl,p,tbl,p,tbl,p,tbl,p] / tbl수=5 / noBorder=0
  / 13행 전수 atLeast / 분리단락 spacing=0 / 메타데이터 유지
- PDF 생성기·PDF 출력본·CandidateA/B 증거 파일 미변경
- Google Docs 변환 QA PASS (GPT Phase 3 검증)

goal: G-muzta7bb-b4a5ab

Co-Authored-By: Claude Sonnet 4.6 <noreply@anthropic.com>
</commit_message>
<xml_diff>
--- a/docs/reference-forms/output/TAI-FORM-C002-blank.docx
+++ b/docs/reference-forms/output/TAI-FORM-C002-blank.docx
@@ -57,9 +57,18 @@
         </w:tc>
       </w:tr>
     </w:tbl>
+    <w:p>
+      <w:pPr>
+        <w:spacing w:after="0" w:before="0"/>
+      </w:pPr>
+      <w:r>
+        <w:t xml:space="preserve"/>
+      </w:r>
+    </w:p>
     <w:tbl>
       <w:tblPr>
-        <w:tblW w:type="dxa" w:w="9637"/>
+        <w:tblW w:type="dxa" w:w="5102"/>
+        <w:jc w:val="right"/>
         <w:tblBorders>
           <w:top w:val="single" w:color="auto" w:sz="4"/>
           <w:left w:val="single" w:color="auto" w:sz="4"/>
@@ -71,246 +80,186 @@
         <w:tblLayout w:type="fixed"/>
       </w:tblPr>
       <w:tblGrid>
-        <w:gridCol w:w="4535"/>
-        <w:gridCol w:w="5102"/>
+        <w:gridCol w:w="1701"/>
+        <w:gridCol w:w="1701"/>
+        <w:gridCol w:w="1701"/>
       </w:tblGrid>
       <w:tr>
-        <w:tc>
-          <w:tcPr>
-            <w:tcW w:type="dxa" w:w="4535"/>
-            <w:tcBorders>
-              <w:top w:val="none" w:color="auto" w:sz="0"/>
-              <w:left w:val="none" w:color="auto" w:sz="0"/>
-              <w:bottom w:val="none" w:color="auto" w:sz="0"/>
-              <w:right w:val="none" w:color="auto" w:sz="0"/>
-            </w:tcBorders>
-            <w:tcMar>
-              <w:top w:type="dxa" w:w="0"/>
-              <w:left w:type="dxa" w:w="0"/>
-              <w:bottom w:type="dxa" w:w="0"/>
-              <w:right w:type="dxa" w:w="0"/>
-            </w:tcMar>
-          </w:tcPr>
-          <w:p>
-            <w:r>
-              <w:t xml:space="preserve"/>
-            </w:r>
-          </w:p>
-        </w:tc>
-        <w:tc>
-          <w:tcPr>
-            <w:tcW w:type="dxa" w:w="5102"/>
-            <w:tcBorders>
-              <w:top w:val="none" w:color="auto" w:sz="0"/>
-              <w:left w:val="none" w:color="auto" w:sz="0"/>
-              <w:bottom w:val="none" w:color="auto" w:sz="0"/>
-              <w:right w:val="none" w:color="auto" w:sz="0"/>
-            </w:tcBorders>
-            <w:tcMar>
-              <w:top w:type="dxa" w:w="0"/>
-              <w:left w:type="dxa" w:w="0"/>
-              <w:bottom w:type="dxa" w:w="0"/>
-              <w:right w:type="dxa" w:w="0"/>
-            </w:tcMar>
-          </w:tcPr>
-          <w:tbl>
-            <w:tblPr>
-              <w:tblW w:type="dxa" w:w="5102"/>
-              <w:tblBorders>
-                <w:top w:val="single" w:color="auto" w:sz="4"/>
-                <w:left w:val="single" w:color="auto" w:sz="4"/>
-                <w:bottom w:val="single" w:color="auto" w:sz="4"/>
-                <w:right w:val="single" w:color="auto" w:sz="4"/>
-                <w:insideH w:val="single" w:color="auto" w:sz="4"/>
-                <w:insideV w:val="single" w:color="auto" w:sz="4"/>
-              </w:tblBorders>
-              <w:tblLayout w:type="fixed"/>
-            </w:tblPr>
-            <w:tblGrid>
-              <w:gridCol w:w="1701"/>
-              <w:gridCol w:w="1701"/>
-              <w:gridCol w:w="1701"/>
-            </w:tblGrid>
-            <w:tr>
-              <w:trPr>
-                <w:trHeight w:val="396" w:hRule="atLeast"/>
-              </w:trPr>
-              <w:tc>
-                <w:tcPr>
-                  <w:tcW w:type="dxa" w:w="1701"/>
-                  <w:tcBorders>
-                    <w:top w:val="single" w:color="000000" w:sz="6"/>
-                    <w:left w:val="single" w:color="000000" w:sz="6"/>
-                    <w:bottom w:val="single" w:color="000000" w:sz="6"/>
-                    <w:right w:val="single" w:color="000000" w:sz="6"/>
-                  </w:tcBorders>
-                  <w:shd w:fill="E8E8E8" w:color="auto" w:val="clear"/>
-                  <w:tcMar>
-                    <w:top w:type="dxa" w:w="170"/>
-                    <w:left w:type="dxa" w:w="170"/>
-                    <w:bottom w:type="dxa" w:w="170"/>
-                    <w:right w:type="dxa" w:w="170"/>
-                  </w:tcMar>
-                  <w:vAlign w:val="center"/>
-                </w:tcPr>
-                <w:p>
-                  <w:pPr>
-                    <w:jc w:val="center"/>
-                  </w:pPr>
-                  <w:r>
-                    <w:rPr>
-                      <w:rFonts w:ascii="NanumGothic" w:cs="NanumGothic" w:eastAsia="NanumGothic" w:hAnsi="NanumGothic"/>
-                      <w:b/>
-                      <w:bCs/>
-                      <w:sz w:val="20"/>
-                      <w:szCs w:val="20"/>
-                    </w:rPr>
-                    <w:t xml:space="preserve">작성</w:t>
-                  </w:r>
-                </w:p>
-              </w:tc>
-              <w:tc>
-                <w:tcPr>
-                  <w:tcW w:type="dxa" w:w="1701"/>
-                  <w:tcBorders>
-                    <w:top w:val="single" w:color="000000" w:sz="6"/>
-                    <w:left w:val="single" w:color="000000" w:sz="6"/>
-                    <w:bottom w:val="single" w:color="000000" w:sz="6"/>
-                    <w:right w:val="single" w:color="000000" w:sz="6"/>
-                  </w:tcBorders>
-                  <w:shd w:fill="E8E8E8" w:color="auto" w:val="clear"/>
-                  <w:tcMar>
-                    <w:top w:type="dxa" w:w="170"/>
-                    <w:left w:type="dxa" w:w="170"/>
-                    <w:bottom w:type="dxa" w:w="170"/>
-                    <w:right w:type="dxa" w:w="170"/>
-                  </w:tcMar>
-                  <w:vAlign w:val="center"/>
-                </w:tcPr>
-                <w:p>
-                  <w:pPr>
-                    <w:jc w:val="center"/>
-                  </w:pPr>
-                  <w:r>
-                    <w:rPr>
-                      <w:rFonts w:ascii="NanumGothic" w:cs="NanumGothic" w:eastAsia="NanumGothic" w:hAnsi="NanumGothic"/>
-                      <w:b/>
-                      <w:bCs/>
-                      <w:sz w:val="20"/>
-                      <w:szCs w:val="20"/>
-                    </w:rPr>
-                    <w:t xml:space="preserve">검토</w:t>
-                  </w:r>
-                </w:p>
-              </w:tc>
-              <w:tc>
-                <w:tcPr>
-                  <w:tcW w:type="dxa" w:w="1701"/>
-                  <w:tcBorders>
-                    <w:top w:val="single" w:color="000000" w:sz="6"/>
-                    <w:left w:val="single" w:color="000000" w:sz="6"/>
-                    <w:bottom w:val="single" w:color="000000" w:sz="6"/>
-                    <w:right w:val="single" w:color="000000" w:sz="6"/>
-                  </w:tcBorders>
-                  <w:shd w:fill="E8E8E8" w:color="auto" w:val="clear"/>
-                  <w:tcMar>
-                    <w:top w:type="dxa" w:w="170"/>
-                    <w:left w:type="dxa" w:w="170"/>
-                    <w:bottom w:type="dxa" w:w="170"/>
-                    <w:right w:type="dxa" w:w="170"/>
-                  </w:tcMar>
-                  <w:vAlign w:val="center"/>
-                </w:tcPr>
-                <w:p>
-                  <w:pPr>
-                    <w:jc w:val="center"/>
-                  </w:pPr>
-                  <w:r>
-                    <w:rPr>
-                      <w:rFonts w:ascii="NanumGothic" w:cs="NanumGothic" w:eastAsia="NanumGothic" w:hAnsi="NanumGothic"/>
-                      <w:b/>
-                      <w:bCs/>
-                      <w:sz w:val="20"/>
-                      <w:szCs w:val="20"/>
-                    </w:rPr>
-                    <w:t xml:space="preserve">승인</w:t>
-                  </w:r>
-                </w:p>
-              </w:tc>
-            </w:tr>
-            <w:tr>
-              <w:trPr>
-                <w:trHeight w:val="850" w:hRule="atLeast"/>
-              </w:trPr>
-              <w:tc>
-                <w:tcPr>
-                  <w:tcW w:type="dxa" w:w="1701"/>
-                  <w:tcBorders>
-                    <w:top w:val="single" w:color="000000" w:sz="6"/>
-                    <w:left w:val="single" w:color="000000" w:sz="6"/>
-                    <w:bottom w:val="single" w:color="000000" w:sz="6"/>
-                    <w:right w:val="single" w:color="000000" w:sz="6"/>
-                  </w:tcBorders>
-                  <w:tcMar>
-                    <w:top w:type="dxa" w:w="170"/>
-                    <w:left w:type="dxa" w:w="170"/>
-                    <w:bottom w:type="dxa" w:w="170"/>
-                    <w:right w:type="dxa" w:w="170"/>
-                  </w:tcMar>
-                </w:tcPr>
-                <w:p>
-                  <w:r>
-                    <w:t xml:space="preserve"/>
-                  </w:r>
-                </w:p>
-              </w:tc>
-              <w:tc>
-                <w:tcPr>
-                  <w:tcW w:type="dxa" w:w="1701"/>
-                  <w:tcBorders>
-                    <w:top w:val="single" w:color="000000" w:sz="6"/>
-                    <w:left w:val="single" w:color="000000" w:sz="6"/>
-                    <w:bottom w:val="single" w:color="000000" w:sz="6"/>
-                    <w:right w:val="single" w:color="000000" w:sz="6"/>
-                  </w:tcBorders>
-                  <w:tcMar>
-                    <w:top w:type="dxa" w:w="170"/>
-                    <w:left w:type="dxa" w:w="170"/>
-                    <w:bottom w:type="dxa" w:w="170"/>
-                    <w:right w:type="dxa" w:w="170"/>
-                  </w:tcMar>
-                </w:tcPr>
-                <w:p>
-                  <w:r>
-                    <w:t xml:space="preserve"/>
-                  </w:r>
-                </w:p>
-              </w:tc>
-              <w:tc>
-                <w:tcPr>
-                  <w:tcW w:type="dxa" w:w="1701"/>
-                  <w:tcBorders>
-                    <w:top w:val="single" w:color="000000" w:sz="6"/>
-                    <w:left w:val="single" w:color="000000" w:sz="6"/>
-                    <w:bottom w:val="single" w:color="000000" w:sz="6"/>
-                    <w:right w:val="single" w:color="000000" w:sz="6"/>
-                  </w:tcBorders>
-                  <w:tcMar>
-                    <w:top w:type="dxa" w:w="170"/>
-                    <w:left w:type="dxa" w:w="170"/>
-                    <w:bottom w:type="dxa" w:w="170"/>
-                    <w:right w:type="dxa" w:w="170"/>
-                  </w:tcMar>
-                </w:tcPr>
-                <w:p>
-                  <w:r>
-                    <w:t xml:space="preserve"/>
-                  </w:r>
-                </w:p>
-              </w:tc>
-            </w:tr>
-          </w:tbl>
-          <w:p/>
+        <w:trPr>
+          <w:trHeight w:val="396" w:hRule="atLeast"/>
+        </w:trPr>
+        <w:tc>
+          <w:tcPr>
+            <w:tcW w:type="dxa" w:w="1701"/>
+            <w:tcBorders>
+              <w:top w:val="single" w:color="000000" w:sz="6"/>
+              <w:left w:val="single" w:color="000000" w:sz="6"/>
+              <w:bottom w:val="single" w:color="000000" w:sz="6"/>
+              <w:right w:val="single" w:color="000000" w:sz="6"/>
+            </w:tcBorders>
+            <w:shd w:fill="E8E8E8" w:color="auto" w:val="clear"/>
+            <w:tcMar>
+              <w:top w:type="dxa" w:w="170"/>
+              <w:left w:type="dxa" w:w="170"/>
+              <w:bottom w:type="dxa" w:w="170"/>
+              <w:right w:type="dxa" w:w="170"/>
+            </w:tcMar>
+            <w:vAlign w:val="center"/>
+          </w:tcPr>
+          <w:p>
+            <w:pPr>
+              <w:jc w:val="center"/>
+            </w:pPr>
+            <w:r>
+              <w:rPr>
+                <w:rFonts w:ascii="NanumGothic" w:cs="NanumGothic" w:eastAsia="NanumGothic" w:hAnsi="NanumGothic"/>
+                <w:b/>
+                <w:bCs/>
+                <w:sz w:val="20"/>
+                <w:szCs w:val="20"/>
+              </w:rPr>
+              <w:t xml:space="preserve">작성</w:t>
+            </w:r>
+          </w:p>
+        </w:tc>
+        <w:tc>
+          <w:tcPr>
+            <w:tcW w:type="dxa" w:w="1701"/>
+            <w:tcBorders>
+              <w:top w:val="single" w:color="000000" w:sz="6"/>
+              <w:left w:val="single" w:color="000000" w:sz="6"/>
+              <w:bottom w:val="single" w:color="000000" w:sz="6"/>
+              <w:right w:val="single" w:color="000000" w:sz="6"/>
+            </w:tcBorders>
+            <w:shd w:fill="E8E8E8" w:color="auto" w:val="clear"/>
+            <w:tcMar>
+              <w:top w:type="dxa" w:w="170"/>
+              <w:left w:type="dxa" w:w="170"/>
+              <w:bottom w:type="dxa" w:w="170"/>
+              <w:right w:type="dxa" w:w="170"/>
+            </w:tcMar>
+            <w:vAlign w:val="center"/>
+          </w:tcPr>
+          <w:p>
+            <w:pPr>
+              <w:jc w:val="center"/>
+            </w:pPr>
+            <w:r>
+              <w:rPr>
+                <w:rFonts w:ascii="NanumGothic" w:cs="NanumGothic" w:eastAsia="NanumGothic" w:hAnsi="NanumGothic"/>
+                <w:b/>
+                <w:bCs/>
+                <w:sz w:val="20"/>
+                <w:szCs w:val="20"/>
+              </w:rPr>
+              <w:t xml:space="preserve">검토</w:t>
+            </w:r>
+          </w:p>
+        </w:tc>
+        <w:tc>
+          <w:tcPr>
+            <w:tcW w:type="dxa" w:w="1701"/>
+            <w:tcBorders>
+              <w:top w:val="single" w:color="000000" w:sz="6"/>
+              <w:left w:val="single" w:color="000000" w:sz="6"/>
+              <w:bottom w:val="single" w:color="000000" w:sz="6"/>
+              <w:right w:val="single" w:color="000000" w:sz="6"/>
+            </w:tcBorders>
+            <w:shd w:fill="E8E8E8" w:color="auto" w:val="clear"/>
+            <w:tcMar>
+              <w:top w:type="dxa" w:w="170"/>
+              <w:left w:type="dxa" w:w="170"/>
+              <w:bottom w:type="dxa" w:w="170"/>
+              <w:right w:type="dxa" w:w="170"/>
+            </w:tcMar>
+            <w:vAlign w:val="center"/>
+          </w:tcPr>
+          <w:p>
+            <w:pPr>
+              <w:jc w:val="center"/>
+            </w:pPr>
+            <w:r>
+              <w:rPr>
+                <w:rFonts w:ascii="NanumGothic" w:cs="NanumGothic" w:eastAsia="NanumGothic" w:hAnsi="NanumGothic"/>
+                <w:b/>
+                <w:bCs/>
+                <w:sz w:val="20"/>
+                <w:szCs w:val="20"/>
+              </w:rPr>
+              <w:t xml:space="preserve">승인</w:t>
+            </w:r>
+          </w:p>
+        </w:tc>
+      </w:tr>
+      <w:tr>
+        <w:trPr>
+          <w:trHeight w:val="850" w:hRule="atLeast"/>
+        </w:trPr>
+        <w:tc>
+          <w:tcPr>
+            <w:tcW w:type="dxa" w:w="1701"/>
+            <w:tcBorders>
+              <w:top w:val="single" w:color="000000" w:sz="6"/>
+              <w:left w:val="single" w:color="000000" w:sz="6"/>
+              <w:bottom w:val="single" w:color="000000" w:sz="6"/>
+              <w:right w:val="single" w:color="000000" w:sz="6"/>
+            </w:tcBorders>
+            <w:tcMar>
+              <w:top w:type="dxa" w:w="170"/>
+              <w:left w:type="dxa" w:w="170"/>
+              <w:bottom w:type="dxa" w:w="170"/>
+              <w:right w:type="dxa" w:w="170"/>
+            </w:tcMar>
+          </w:tcPr>
+          <w:p>
+            <w:r>
+              <w:t xml:space="preserve"/>
+            </w:r>
+          </w:p>
+        </w:tc>
+        <w:tc>
+          <w:tcPr>
+            <w:tcW w:type="dxa" w:w="1701"/>
+            <w:tcBorders>
+              <w:top w:val="single" w:color="000000" w:sz="6"/>
+              <w:left w:val="single" w:color="000000" w:sz="6"/>
+              <w:bottom w:val="single" w:color="000000" w:sz="6"/>
+              <w:right w:val="single" w:color="000000" w:sz="6"/>
+            </w:tcBorders>
+            <w:tcMar>
+              <w:top w:type="dxa" w:w="170"/>
+              <w:left w:type="dxa" w:w="170"/>
+              <w:bottom w:type="dxa" w:w="170"/>
+              <w:right w:type="dxa" w:w="170"/>
+            </w:tcMar>
+          </w:tcPr>
+          <w:p>
+            <w:r>
+              <w:t xml:space="preserve"/>
+            </w:r>
+          </w:p>
+        </w:tc>
+        <w:tc>
+          <w:tcPr>
+            <w:tcW w:type="dxa" w:w="1701"/>
+            <w:tcBorders>
+              <w:top w:val="single" w:color="000000" w:sz="6"/>
+              <w:left w:val="single" w:color="000000" w:sz="6"/>
+              <w:bottom w:val="single" w:color="000000" w:sz="6"/>
+              <w:right w:val="single" w:color="000000" w:sz="6"/>
+            </w:tcBorders>
+            <w:tcMar>
+              <w:top w:type="dxa" w:w="170"/>
+              <w:left w:type="dxa" w:w="170"/>
+              <w:bottom w:type="dxa" w:w="170"/>
+              <w:right w:type="dxa" w:w="170"/>
+            </w:tcMar>
+          </w:tcPr>
+          <w:p>
+            <w:r>
+              <w:t xml:space="preserve"/>
+            </w:r>
+          </w:p>
         </w:tc>
       </w:tr>
     </w:tbl>

</xml_diff>